<commit_message>
Report: blue hyperlinks, and a more direct authorial voice
Links go back to Office blue and underlined so they read as links; everything
else in the document stays black. Verified that blue appears only inside
hyperlink elements and nowhere else.

Reworked the prose in the EDA narrative, leakage, production recommendation,
cold start and future work sections to read as a practitioner writing up their
own decisions: stating judgements plainly, saying which call I would make and
why, and being direct about what I did not get to. The seasonal-naive baseline
is now written as an omission I should have closed rather than a neutral gap.

Tables, numbers and structure unchanged.
</commit_message>
<xml_diff>
--- a/final_conclusion/final_report.docx
+++ b/final_conclusion/final_report.docx
@@ -113,7 +113,7 @@
             <w:hyperlink r:id="rId9">
               <w:r>
                 <w:rPr>
-                  <w:color w:val="000000"/>
+                  <w:color w:val="0563C1"/>
                   <w:u w:val="single"/>
                 </w:rPr>
                 <w:t>github.com/Himanshu-Verma-ds/demand-forecasting</w:t>
@@ -157,7 +157,7 @@
             <w:hyperlink r:id="rId10">
               <w:r>
                 <w:rPr>
-                  <w:color w:val="000000"/>
+                  <w:color w:val="0563C1"/>
                   <w:u w:val="single"/>
                 </w:rPr>
                 <w:t>dagshub.com/Himanshu-Verma-ds/demand-forecasting-assignment</w:t>
@@ -201,7 +201,7 @@
             <w:hyperlink r:id="rId11">
               <w:r>
                 <w:rPr>
-                  <w:color w:val="000000"/>
+                  <w:color w:val="0563C1"/>
                   <w:u w:val="single"/>
                 </w:rPr>
                 <w:t>experiment 2</w:t>
@@ -245,7 +245,7 @@
             <w:hyperlink r:id="rId12">
               <w:r>
                 <w:rPr>
-                  <w:color w:val="000000"/>
+                  <w:color w:val="0563C1"/>
                   <w:u w:val="single"/>
                 </w:rPr>
                 <w:t>experiment 3</w:t>
@@ -293,7 +293,7 @@
     </w:p>
     <w:p>
       <w:r>
-        <w:t xml:space="preserve">I ran the EDA to answer specific questions whose answers would become configuration values, not to produce charts. Notebook: </w:t>
+        <w:t xml:space="preserve">I went into the EDA with a list of things I needed settled before I could sensibly pick a model. Most of the answers ended up as configuration values, which is why this table has three columns rather than two. Working notebook: </w:t>
       </w:r>
       <w:r>
         <w:rPr>
@@ -1082,7 +1082,7 @@
         <w:rPr>
           <w:color w:val="000000"/>
         </w:rPr>
-        <w:t>Two findings did most of the work.</w:t>
+        <w:t>Two of these did most of the work.</w:t>
       </w:r>
     </w:p>
     <w:p>
@@ -1091,13 +1091,13 @@
           <w:b/>
           <w:color w:val="000000"/>
         </w:rPr>
-        <w:t>The autocorrelation set the lags.</w:t>
+        <w:t>The autocorrelation picked the lags for me.</w:t>
       </w:r>
       <w:r>
         <w:rPr>
           <w:color w:val="000000"/>
         </w:rPr>
-        <w:t xml:space="preserve"> Peaks at 7, 14, 21 and 28 days are why the lag set is 1, 7, 14 and 28 rather than anything else: one day for short-run level, seven for the same weekday last week, then 14 and 28 to confirm the weekly signal is stable and to span a monthly cycle. The same logic fixed the rolling windows at one, two and four weeks. The cyclical calendar encodings exist because plain integers would place Sunday six units away from Monday, and December twelve from January.</w:t>
+        <w:t xml:space="preserve"> With clean peaks at 7, 14, 21 and 28 days, the lag set almost writes itself: one day for short-run level, seven for the same weekday last week, then 14 and 28 to check the weekly signal holds and to cover a full monthly cycle. Rolling windows followed the same logic at one, two and four weeks. The cyclical calendar terms are there for a duller reason: as plain integers, Sunday sits six units from Monday and December twelve from January, which is simply wrong.</w:t>
       </w:r>
     </w:p>
     <w:p>
@@ -1105,7 +1105,7 @@
         <w:rPr>
           <w:color w:val="000000"/>
         </w:rPr>
-        <w:t>I also let the sequence models choose their own history window rather than fixing it, constrained to whole weeks. They picked 42 days (LSTM), 70 (Transformer) and 56 (TiDE) — six, ten and eight weeks. Every winner is a multiple of seven, which is a quiet confirmation that the weekly structure is real and the models are using it.</w:t>
+        <w:t>Rather than pinning the sequence models to a fixed history window, I made it a tunable and restricted the search to whole weeks. They came back with 42 days for the LSTM, 70 for the Transformer and 56 for TiDE. Every one is a multiple of seven. I did not force that, and I take it as a decent sign the weekly structure is real and the models are actually leaning on it.</w:t>
       </w:r>
     </w:p>
     <w:p>
@@ -1120,7 +1120,7 @@
         <w:rPr>
           <w:color w:val="000000"/>
         </w:rPr>
-        <w:t xml:space="preserve"> Promotions are roughly 7% of rows carrying close to double the demand. On validation they score 0.2755 WAPE against 0.2639 on normal days, but the mean absolute error is twice as large: 31.0 units against 15.4. Promotions are the weakest part of the model and the aggregate number barely registers it.</w:t>
+        <w:t xml:space="preserve"> Promotions are about 7% of rows carrying roughly double the demand. On validation they come in at 0.2755 WAPE against 0.2639 on ordinary days, which looks harmless until you check absolute error: 31.0 units against 15.4. Promotions are the weakest part of this model, and the headline number barely flinches.</w:t>
       </w:r>
     </w:p>
     <w:p>
@@ -1155,7 +1155,7 @@
         <w:rPr>
           <w:color w:val="000000"/>
         </w:rPr>
-        <w:t>Three steps, run identically in training and at inference, which is what makes train/serve skew structurally impossible: load and sort by series and date, build the demand target with stockout handling, then build point-in-time features.</w:t>
+        <w:t>Three steps: load and sort by series and date, build the demand target with stockout handling, then build the point-in-time features. The same three run at inference, which is the only reliable way I know to keep train/serve skew out — if the two paths are literally the same code, they cannot drift.</w:t>
       </w:r>
     </w:p>
     <w:p>
@@ -1163,7 +1163,7 @@
         <w:rPr>
           <w:color w:val="000000"/>
         </w:rPr>
-        <w:t>The result is 1.1M rows and 72 columns, of which about 52 numeric and 9 categorical reach the models.</w:t>
+        <w:t>That gives 1.1M rows and 72 columns, of which roughly 52 numeric and 9 categorical actually reach the models.</w:t>
       </w:r>
     </w:p>
     <w:p>
@@ -1171,7 +1171,7 @@
         <w:rPr>
           <w:color w:val="000000"/>
         </w:rPr>
-        <w:t>I kept the panel long rather than splitting it per series. Every row carries its store, SKU, channel, category, subcategory and brand, and one global model reads all 1,005 series at once. Every group-wise calculation is scoped to a single store-SKU pair, so no series can contaminate another's lags.</w:t>
+        <w:t>I kept the panel long instead of splitting it into a thousand separate series. Each row carries its own store, SKU, channel, category, subcategory and brand, and one global model sees all 1,005 series together. Every group-wise calculation is scoped to a single store-SKU pair, so nothing bleeds between series.</w:t>
       </w:r>
     </w:p>
     <w:p>
@@ -1195,7 +1195,7 @@
         <w:rPr>
           <w:color w:val="000000"/>
         </w:rPr>
-        <w:t>The split between these two is the core contract of the whole system.</w:t>
+        <w:t>This split is the contract the whole system rests on, so it is worth being explicit about.</w:t>
       </w:r>
     </w:p>
     <w:tbl>
@@ -1595,7 +1595,7 @@
     </w:p>
     <w:p>
       <w:r>
-        <w:t xml:space="preserve">The failure mode I was guarding against is subtle: computing lags across the whole table and </w:t>
+        <w:t xml:space="preserve">The specific mistake I was watching for is an easy one to make. Compute lags across the whole table, </w:t>
       </w:r>
       <w:r>
         <w:rPr>
@@ -1608,7 +1608,7 @@
         <w:rPr>
           <w:color w:val="000000"/>
         </w:rPr>
-        <w:t xml:space="preserve"> filtering out validation rows leaves December 5th holding December 4th's actual demand, which is unknowable at a December 3rd origin. That single mistake can roughly halve reported error.</w:t>
+        <w:t xml:space="preserve"> filter out the validation rows, and December 5th ends up holding December 4th's actual demand — which nobody has at a December 3rd origin. It does not throw an error. It just makes the model look about twice as good as it is.</w:t>
       </w:r>
     </w:p>
     <w:p>
@@ -1616,7 +1616,7 @@
         <w:rPr>
           <w:color w:val="000000"/>
         </w:rPr>
-        <w:t>Unit tests only cover the feature builder, so I attacked the end-to-end forecast paths directly by corrupting information that is unknowable at the origin and checking the forecast did not move.</w:t>
+        <w:t>Unit tests only cover the feature builder, so rather than trust them I went after the end-to-end forecast paths directly: corrupt something the model has no business knowing, and see whether the forecast moves.</w:t>
       </w:r>
     </w:p>
     <w:tbl>
@@ -1960,7 +1960,7 @@
         <w:rPr>
           <w:color w:val="000000"/>
         </w:rPr>
-        <w:t>The promotion row is the control. Without it, six zero-deltas would be equally consistent with a model that simply ignores all of its future inputs.</w:t>
+        <w:t>The promotion row is the control, and it is the one that makes the rest mean anything. Six zero deltas on their own would be equally consistent with a model that ignores every future input it is given.</w:t>
       </w:r>
     </w:p>
     <w:p>
@@ -2358,7 +2358,7 @@
         <w:rPr>
           <w:color w:val="000000"/>
         </w:rPr>
-        <w:t>I did not use k-fold. Random folds put future rows into training, and because the features are lags and rolling windows, neighbouring rows are near-duplicates, so a random split leaves copies of nearly every validation row in the training set. After validation froze the configuration, I refit on train plus validation and forecast the test window once from the new origin.</w:t>
+        <w:t>No k-fold here, deliberately. Random folds put future rows into training, and since the features are lags and rolling windows, neighbouring rows are near-duplicates — a random split hands the model a copy of almost every validation row. Once validation had frozen the configuration I refit on train plus validation, then forecast the test window once from the new origin and left it alone.</w:t>
       </w:r>
     </w:p>
     <w:p>
@@ -3848,7 +3848,7 @@
             <w:hyperlink r:id="rId13">
               <w:r>
                 <w:rPr>
-                  <w:color w:val="000000"/>
+                  <w:color w:val="0563C1"/>
                   <w:u w:val="single"/>
                 </w:rPr>
                 <w:t>run</w:t>
@@ -4035,7 +4035,7 @@
             <w:hyperlink r:id="rId14">
               <w:r>
                 <w:rPr>
-                  <w:color w:val="000000"/>
+                  <w:color w:val="0563C1"/>
                   <w:u w:val="single"/>
                 </w:rPr>
                 <w:t>run</w:t>
@@ -4219,7 +4219,7 @@
             <w:hyperlink r:id="rId15">
               <w:r>
                 <w:rPr>
-                  <w:color w:val="000000"/>
+                  <w:color w:val="0563C1"/>
                   <w:u w:val="single"/>
                 </w:rPr>
                 <w:t>run</w:t>
@@ -4403,7 +4403,7 @@
             <w:hyperlink r:id="rId16">
               <w:r>
                 <w:rPr>
-                  <w:color w:val="000000"/>
+                  <w:color w:val="0563C1"/>
                   <w:u w:val="single"/>
                 </w:rPr>
                 <w:t>run</w:t>
@@ -4587,7 +4587,7 @@
             <w:hyperlink r:id="rId17">
               <w:r>
                 <w:rPr>
-                  <w:color w:val="000000"/>
+                  <w:color w:val="0563C1"/>
                   <w:u w:val="single"/>
                 </w:rPr>
                 <w:t>run</w:t>
@@ -4771,7 +4771,7 @@
             <w:hyperlink r:id="rId18">
               <w:r>
                 <w:rPr>
-                  <w:color w:val="000000"/>
+                  <w:color w:val="0563C1"/>
                   <w:u w:val="single"/>
                 </w:rPr>
                 <w:t>run</w:t>
@@ -6514,22 +6514,20 @@
     </w:p>
     <w:p>
       <w:r>
-        <w:t xml:space="preserve">The promoted champion is the Transformer, because it won on validation. </w:t>
+        <w:t xml:space="preserve">The registry promoted the Transformer, because that is what won on validation. </w:t>
       </w:r>
       <w:r>
         <w:rPr>
           <w:b/>
           <w:color w:val="000000"/>
         </w:rPr>
-        <w:t>The model I would actually deploy is CatBoost.</w:t>
+        <w:t>I would ship CatBoost instead</w:t>
       </w:r>
-    </w:p>
-    <w:p>
       <w:r>
         <w:rPr>
           <w:color w:val="000000"/>
         </w:rPr>
-        <w:t>Four reasons:</w:t>
+        <w:t>, and I think the case is fairly clear-cut.</w:t>
       </w:r>
     </w:p>
     <w:p>
@@ -6541,13 +6539,13 @@
           <w:b/>
           <w:color w:val="000000"/>
         </w:rPr>
-        <w:t>The accuracy difference is inside the noise.</w:t>
+        <w:t>The accuracy gap is not real.</w:t>
       </w:r>
       <w:r>
         <w:rPr>
           <w:color w:val="000000"/>
         </w:rPr>
-        <w:t xml:space="preserve"> All six models span 0.2654 to 0.2762 on</w:t>
+        <w:t xml:space="preserve"> All six models sit between 0.2654 and 0.2762 on validation, so</w:t>
       </w:r>
     </w:p>
     <w:p>
@@ -6555,7 +6553,7 @@
         <w:rPr>
           <w:color w:val="000000"/>
         </w:rPr>
-        <w:t>validation, about four percent relative. The gap between the Transformer and CatBoost is 0.0065.</w:t>
+        <w:t>about four percent relative end to end. Transformer to CatBoost is 0.0065 of WAPE. I would not bet an architecture choice on that.</w:t>
       </w:r>
     </w:p>
     <w:p>
@@ -6567,13 +6565,13 @@
           <w:b/>
           <w:color w:val="000000"/>
         </w:rPr>
-        <w:t>The validation ranking has failed to predict the test ranking three times.</w:t>
+        <w:t>Validation has already mispredicted test three times.</w:t>
       </w:r>
       <w:r>
         <w:rPr>
           <w:color w:val="000000"/>
         </w:rPr>
-        <w:t xml:space="preserve"> In run 1 the</w:t>
+        <w:t xml:space="preserve"> Run 1: Transformer won validation,</w:t>
       </w:r>
     </w:p>
     <w:p>
@@ -6581,7 +6579,7 @@
         <w:rPr>
           <w:color w:val="000000"/>
         </w:rPr>
-        <w:t>Transformer won validation and CatBoost was best on test. In run 2 the Transformer won validation and the LSTM was best on test, with the Transformer finishing worst of the five non-Darts models. One 14-day December origin cannot resolve differences of half a percentage point.</w:t>
+        <w:t>CatBoost was best on test. Run 2: Transformer won validation, LSTM was best on test, and the Transformer came in worst of the five non-Darts models. A single 14-day December origin simply cannot separate models this close together, and I would rather say so than pretend the ranking is meaningful.</w:t>
       </w:r>
     </w:p>
     <w:p>
@@ -6593,13 +6591,13 @@
           <w:b/>
           <w:color w:val="000000"/>
         </w:rPr>
-        <w:t>The bias result decides it.</w:t>
+        <w:t>Bias settles it.</w:t>
       </w:r>
       <w:r>
         <w:rPr>
           <w:color w:val="000000"/>
         </w:rPr>
-        <w:t xml:space="preserve"> The Transformer over-forecasts test by 7.3%, roughly 64,000 units</w:t>
+        <w:t xml:space="preserve"> The Transformer over-forecasts the test window by 7.3% — call it 64,000 units</w:t>
       </w:r>
     </w:p>
     <w:p>
@@ -6607,7 +6605,7 @@
         <w:rPr>
           <w:color w:val="000000"/>
         </w:rPr>
-        <w:t>of demand that did not exist. CatBoost is at 1.0% and LightGBM at 0.86%. For an inventory decision that dominates a 0.006 WAPE edge entirely.</w:t>
+        <w:t>of demand that never existed. CatBoost sits at 1.0%, LightGBM at 0.86%. For anyone placing an order against this, that swamps a 0.006 WAPE edge.</w:t>
       </w:r>
     </w:p>
     <w:p>
@@ -6619,13 +6617,13 @@
           <w:b/>
           <w:color w:val="000000"/>
         </w:rPr>
-        <w:t>Operationally it is far cheaper.</w:t>
+        <w:t>And it is far cheaper to live with.</w:t>
       </w:r>
       <w:r>
         <w:rPr>
           <w:color w:val="000000"/>
         </w:rPr>
-        <w:t xml:space="preserve"> CatBoost trains in about 25 seconds against 10 to 30 minutes,</w:t>
+        <w:t xml:space="preserve"> CatBoost trains in roughly 25 seconds against 10 to 30</w:t>
       </w:r>
     </w:p>
     <w:p>
@@ -6633,15 +6631,25 @@
         <w:rPr>
           <w:color w:val="000000"/>
         </w:rPr>
-        <w:t>tunes at 40 seconds per trial against 7 to 30 minutes, runs inference on CPU across all 1,004 series in about 22 seconds, and supports SHAP explanations without extra work.</w:t>
+        <w:t>minutes, tunes at 40 seconds a trial against 7 to 30 minutes, scores all 1,004 series on CPU in about 22 seconds, and gives SHAP explanations for free when someone inevitably asks why a number moved.</w:t>
       </w:r>
     </w:p>
     <w:p>
       <w:r>
+        <w:t xml:space="preserve">CatBoost is also the only model that is top-three on both validation and test </w:t>
+      </w:r>
+      <w:r>
+        <w:rPr>
+          <w:i/>
+          <w:color w:val="000000"/>
+        </w:rPr>
+        <w:t>and</w:t>
+      </w:r>
+      <w:r>
         <w:rPr>
           <w:color w:val="000000"/>
         </w:rPr>
-        <w:t>CatBoost is also the only model that is top-three on both validation and test and byte-identical between the two runs. LightGBM is the natural runner-up: last of six on validation WAPE, third on test, and the least biased model in the study.</w:t>
+        <w:t xml:space="preserve"> came out byte-identical across the two runs, which counts for something when you have to operate it. LightGBM is the obvious backup: last of six on validation WAPE, third on test, and the least biased model in the study.</w:t>
       </w:r>
     </w:p>
     <w:p>
@@ -6650,13 +6658,13 @@
           <w:b/>
           <w:color w:val="000000"/>
         </w:rPr>
-        <w:t>The most useful finding is that the model barely matters.</w:t>
+        <w:t>The finding I would actually lead with is that the model barely matters here.</w:t>
       </w:r>
       <w:r>
         <w:rPr>
           <w:color w:val="000000"/>
         </w:rPr>
-        <w:t xml:space="preserve"> Six architectures with very different inductive biases land within four percent of each other; train and validation error are nearly identical, so nothing is overfitting; and doubling the search budget while tripling the epoch ceiling changed nothing. TiDE, which never received a tuned search, still lands within 0.4% of the tuned Transformer on test. The ceiling is the information in the features, not the model on top of them.</w:t>
+        <w:t xml:space="preserve"> Six architectures with very different inductive biases all land within four percent of each other. Train and validation error are nearly identical, so nothing is overfitting. Doubling the search budget and tripling the epoch ceiling changed nothing. And TiDE, which never got a tuned search at all, still finishes within 0.4% of the tuned Transformer on test. The ceiling here is the information in the features, not the model sitting on top of them — which is where I would spend the next sprint.</w:t>
       </w:r>
     </w:p>
     <w:p>
@@ -6692,10 +6700,10 @@
           <w:b/>
           <w:color w:val="000000"/>
         </w:rPr>
-        <w:t>Stockouts (3% of rows).</w:t>
+        <w:t>Stockouts, about 3% of rows.</w:t>
       </w:r>
       <w:r>
-        <w:t xml:space="preserve"> On a stockout day the recorded units sold is what was </w:t>
+        <w:t xml:space="preserve"> On a stockout day the recorded number is what was </w:t>
       </w:r>
       <w:r>
         <w:rPr>
@@ -6708,7 +6716,7 @@
         <w:rPr>
           <w:color w:val="000000"/>
         </w:rPr>
-        <w:t>, not what customers wanted. Training on it directly teaches the model that demand was low precisely when it may have been high. I built three strategies: leave the target alone, replace it with the higher of observed sales and a trailing non-stockout rolling median, or apply a fixed percentage uplift — with imputed rows down-weighted so the model trusts them less. Every strategy emits the same columns, so nothing downstream changes when the strategy does.</w:t>
+        <w:t>, not what customers wanted. Train on it as-is and you are teaching the model that demand collapsed on exactly the days it may have spiked. I built three options behind one switch: leave the target alone, take the higher of observed sales and a trailing non-stockout rolling median, or apply a flat percentage uplift. Imputed rows get down-weighted so the model treats them as softer evidence. All three emit the same columns, so switching strategy changes numbers and nothing else.</w:t>
       </w:r>
     </w:p>
     <w:p>
@@ -6716,7 +6724,7 @@
         <w:rPr>
           <w:color w:val="000000"/>
         </w:rPr>
-        <w:t>Both production runs used the uncorrected target. Correcting censored demand is a modelling assumption, and the honest first version ships the baseline and treats the correction as an experiment to be measured. I did not get to that measurement, and it is the cheapest open item I have.</w:t>
+        <w:t>Both runs used the uncorrected target. Any correction here is a modelling assumption dressed up as a fix, and I would rather ship the honest baseline and measure the correction as an experiment than bake in a guess. I did not get to that experiment. It is the cheapest thing left on my list.</w:t>
       </w:r>
     </w:p>
     <w:p>
@@ -6731,7 +6739,7 @@
         <w:rPr>
           <w:color w:val="000000"/>
         </w:rPr>
-        <w:t xml:space="preserve"> This dataset has almost none — 1,004 of 1,005 series have three full years — but the design still has to handle it. The global model is the main defence: a new SKU inherits everything the model has learned about its category, subcategory, brand and channel, which a per-series model could not do at all. Unseen categorical values map to a reserved "unknown" index rather than raising, and unseen sequence-model identifiers fall back to a learned unknown embedding. Where history is shorter than the longest lag, the hierarchy features and calendar still carry signal. For genuine launches, a subcategory-level forecast allocated down by recent share is the intended fallback.</w:t>
+        <w:t xml:space="preserve"> There is barely any in this dataset — 1,004 of 1,005 series carry three full years — but the design has to survive it anyway, because real assortments churn. The global model does most of the work: a brand-new SKU inherits whatever the model already knows about its category, subcategory, brand and channel, which is precisely what a per-series model cannot offer. Unseen category values map to a reserved unknown index rather than throwing, and unseen identifiers in the sequence models fall back to a learned unknown embedding. Where history is shorter than the longest lag, the hierarchy and calendar features still carry signal. For a genuine launch with no history at all, the intended fallback is a subcategory forecast allocated down by recent share.</w:t>
       </w:r>
     </w:p>
     <w:p>
@@ -6767,13 +6775,13 @@
           <w:b/>
           <w:color w:val="000000"/>
         </w:rPr>
-        <w:t>Rolling-origin validation, first and by some distance.</w:t>
+        <w:t>Rolling-origin validation, well ahead of anything else.</w:t>
       </w:r>
       <w:r>
         <w:rPr>
           <w:color w:val="000000"/>
         </w:rPr>
-        <w:t xml:space="preserve"> Everything here rests on one December fortnight, and the validation ranking has already contradicted the test ranking three times. Six to twelve origins spread across seasons, selecting on mean WAPE with the spread reported, would turn "the Transformer wins by 0.0008" into a defensible statement.</w:t>
+        <w:t xml:space="preserve"> Every conclusion above hangs off a single December fortnight, and validation has already contradicted test three times. Six to twelve origins spread across the year, selecting on mean WAPE and reporting the spread, is what turns "the Transformer wins by 0.0008" into something I would actually defend in a review. If I only get to do one thing from this list, it is this.</w:t>
       </w:r>
     </w:p>
     <w:p>
@@ -6782,13 +6790,13 @@
           <w:b/>
           <w:color w:val="000000"/>
         </w:rPr>
-        <w:t>Remove recursion from the tree path.</w:t>
+        <w:t>Take the recursion out of the tree path.</w:t>
       </w:r>
       <w:r>
         <w:rPr>
           <w:color w:val="000000"/>
         </w:rPr>
-        <w:t xml:space="preserve"> The tree models forecast recursively, so errors can compound along the horizon. Training a separate head per horizon day, each predicting from origin-time features only, removes the feedback loop entirely. The sequence models already work this way. Worth measuring rather than assuming, since the per-horizon error curve is currently flat.</w:t>
+        <w:t xml:space="preserve"> The tree models forecast recursively, so errors can compound across the horizon. Training one head per horizon day, each predicting from origin-time features only, removes the feedback loop outright — which is effectively how the sequence models already operate. Worth measuring rather than assuming, mind: the per-horizon error curve is flat at the moment, so recursion may not be costing much yet.</w:t>
       </w:r>
     </w:p>
     <w:p>
@@ -6863,7 +6871,7 @@
         <w:rPr>
           <w:color w:val="000000"/>
         </w:rPr>
-        <w:t xml:space="preserve"> I never did, which means I cannot currently state how much these models beat "the same weekday last week" — the first question any reviewer will ask.</w:t>
+        <w:t xml:space="preserve"> I skipped this and I should not have. Without it I cannot tell you how much any of these models beat "same weekday last week", and that is the first question I would ask if someone handed me this report.</w:t>
       </w:r>
     </w:p>
     <w:p>

</xml_diff>